<commit_message>
Commit du 15/05/2026 11:23:27
</commit_message>
<xml_diff>
--- a/Manuel_LIM_final_mise_en_page.docx
+++ b/Manuel_LIM_final_mise_en_page.docx
@@ -1361,7 +1361,7 @@
                 <w:noProof/>
                 <w:webHidden/>
               </w:rPr>
-              <w:t>10</w:t>
+              <w:t>9</w:t>
             </w:r>
             <w:r>
               <w:rPr>
@@ -1708,7 +1708,7 @@
                 <w:noProof/>
                 <w:webHidden/>
               </w:rPr>
-              <w:t>12</w:t>
+              <w:t>13</w:t>
             </w:r>
             <w:r>
               <w:rPr>
@@ -1918,7 +1918,7 @@
                 <w:noProof/>
                 <w:webHidden/>
               </w:rPr>
-              <w:t>13</w:t>
+              <w:t>14</w:t>
             </w:r>
             <w:r>
               <w:rPr>

</xml_diff>

<commit_message>
Commit LIM2 - 2026-05-25 08:43:43
</commit_message>
<xml_diff>
--- a/Manuel_LIM_final_mise_en_page.docx
+++ b/Manuel_LIM_final_mise_en_page.docx
@@ -193,10 +193,10 @@
           <w:sz w:val="24"/>
         </w:rPr>
         <w:drawing>
-          <wp:inline distT="0" distB="0" distL="0" distR="0" wp14:anchorId="6F14ACAE" wp14:editId="21083C64">
-            <wp:extent cx="3162300" cy="3104977"/>
-            <wp:effectExtent l="0" t="0" r="0" b="635"/>
-            <wp:docPr id="593647281" name="Image 1" descr="Une image contenant texte, capture d’écran, Police, cercle&#10;&#10;Le contenu généré par l’IA peut être incorrect."/>
+          <wp:inline distT="0" distB="0" distL="0" distR="0" wp14:anchorId="6F14ACAE" wp14:editId="37D9E7E1">
+            <wp:extent cx="3116688" cy="3116688"/>
+            <wp:effectExtent l="0" t="0" r="7620" b="7620"/>
+            <wp:docPr id="593647281" name="Image 1"/>
             <wp:cNvGraphicFramePr>
               <a:graphicFrameLocks xmlns:a="http://schemas.openxmlformats.org/drawingml/2006/main" noChangeAspect="1"/>
             </wp:cNvGraphicFramePr>
@@ -204,7 +204,7 @@
               <a:graphicData uri="http://schemas.openxmlformats.org/drawingml/2006/picture">
                 <pic:pic xmlns:pic="http://schemas.openxmlformats.org/drawingml/2006/picture">
                   <pic:nvPicPr>
-                    <pic:cNvPr id="593647281" name="Image 1" descr="Une image contenant texte, capture d’écran, Police, cercle&#10;&#10;Le contenu généré par l’IA peut être incorrect."/>
+                    <pic:cNvPr id="593647281" name="Image 1"/>
                     <pic:cNvPicPr>
                       <a:picLocks noChangeAspect="1" noChangeArrowheads="1"/>
                     </pic:cNvPicPr>
@@ -217,7 +217,6 @@
                         </a:ext>
                       </a:extLst>
                     </a:blip>
-                    <a:srcRect/>
                     <a:stretch>
                       <a:fillRect/>
                     </a:stretch>
@@ -225,7 +224,7 @@
                   <pic:spPr bwMode="auto">
                     <a:xfrm>
                       <a:off x="0" y="0"/>
-                      <a:ext cx="3174227" cy="3116688"/>
+                      <a:ext cx="3116688" cy="3116688"/>
                     </a:xfrm>
                     <a:prstGeom prst="rect">
                       <a:avLst/>
@@ -8275,13 +8274,7 @@
         <w:rPr>
           <w:rStyle w:val="Accentuationintense"/>
         </w:rPr>
-        <w:t xml:space="preserve"> : </w:t>
-      </w:r>
-      <w:r>
-        <w:rPr>
-          <w:rStyle w:val="Accentuationintense"/>
-        </w:rPr>
-        <w:t>Gestion de la double parité</w:t>
+        <w:t> : Gestion de la double parité</w:t>
       </w:r>
     </w:p>
     <w:p>
@@ -9552,68 +9545,6 @@
           <w:sz w:val="24"/>
         </w:rPr>
       </w:pPr>
-      <w:r>
-        <w:rPr>
-          <w:rFonts w:ascii="Calibri" w:hAnsi="Calibri"/>
-          <w:noProof/>
-          <w:sz w:val="24"/>
-        </w:rPr>
-        <w:drawing>
-          <wp:anchor distT="0" distB="0" distL="114300" distR="114300" simplePos="0" relativeHeight="251658240" behindDoc="0" locked="0" layoutInCell="1" allowOverlap="1" wp14:anchorId="025A1651" wp14:editId="3419C27D">
-            <wp:simplePos x="0" y="0"/>
-            <wp:positionH relativeFrom="column">
-              <wp:posOffset>4276090</wp:posOffset>
-            </wp:positionH>
-            <wp:positionV relativeFrom="paragraph">
-              <wp:posOffset>10160</wp:posOffset>
-            </wp:positionV>
-            <wp:extent cx="298450" cy="214630"/>
-            <wp:effectExtent l="0" t="0" r="6350" b="0"/>
-            <wp:wrapNone/>
-            <wp:docPr id="372003884" name="Image 1"/>
-            <wp:cNvGraphicFramePr>
-              <a:graphicFrameLocks xmlns:a="http://schemas.openxmlformats.org/drawingml/2006/main" noChangeAspect="1"/>
-            </wp:cNvGraphicFramePr>
-            <a:graphic xmlns:a="http://schemas.openxmlformats.org/drawingml/2006/main">
-              <a:graphicData uri="http://schemas.openxmlformats.org/drawingml/2006/picture">
-                <pic:pic xmlns:pic="http://schemas.openxmlformats.org/drawingml/2006/picture">
-                  <pic:nvPicPr>
-                    <pic:cNvPr id="372003884" name=""/>
-                    <pic:cNvPicPr/>
-                  </pic:nvPicPr>
-                  <pic:blipFill>
-                    <a:blip r:embed="rId16">
-                      <a:extLst>
-                        <a:ext uri="{28A0092B-C50C-407E-A947-70E740481C1C}">
-                          <a14:useLocalDpi xmlns:a14="http://schemas.microsoft.com/office/drawing/2010/main" val="0"/>
-                        </a:ext>
-                      </a:extLst>
-                    </a:blip>
-                    <a:stretch>
-                      <a:fillRect/>
-                    </a:stretch>
-                  </pic:blipFill>
-                  <pic:spPr>
-                    <a:xfrm>
-                      <a:off x="0" y="0"/>
-                      <a:ext cx="298450" cy="214630"/>
-                    </a:xfrm>
-                    <a:prstGeom prst="rect">
-                      <a:avLst/>
-                    </a:prstGeom>
-                  </pic:spPr>
-                </pic:pic>
-              </a:graphicData>
-            </a:graphic>
-            <wp14:sizeRelH relativeFrom="margin">
-              <wp14:pctWidth>0</wp14:pctWidth>
-            </wp14:sizeRelH>
-            <wp14:sizeRelV relativeFrom="margin">
-              <wp14:pctHeight>0</wp14:pctHeight>
-            </wp14:sizeRelV>
-          </wp:anchor>
-        </w:drawing>
-      </w:r>
       <w:proofErr w:type="gramStart"/>
       <w:r>
         <w:rPr>
@@ -9628,7 +9559,35 @@
           <w:rFonts w:ascii="Calibri" w:hAnsi="Calibri"/>
           <w:sz w:val="24"/>
         </w:rPr>
-        <w:t xml:space="preserve"> le bouton lecture situé dans la barre supérieure ;</w:t>
+        <w:t xml:space="preserve"> le bouton lecture situé dans la barre supérieure</w:t>
+      </w:r>
+      <w:r>
+        <w:rPr>
+          <w:rFonts w:ascii="Calibri" w:hAnsi="Calibri"/>
+          <w:sz w:val="24"/>
+        </w:rPr>
+        <w:t>. L</w:t>
+      </w:r>
+      <w:r>
+        <w:rPr>
+          <w:rFonts w:ascii="Calibri" w:hAnsi="Calibri"/>
+          <w:sz w:val="24"/>
+        </w:rPr>
+        <w:t xml:space="preserve">'application entre automatiquement en mode standby sur la première ligne du parcours </w:t>
+      </w:r>
+      <w:r>
+        <w:rPr>
+          <w:rFonts w:ascii="Calibri" w:hAnsi="Calibri"/>
+          <w:sz w:val="24"/>
+        </w:rPr>
+        <w:t>L</w:t>
+      </w:r>
+      <w:r>
+        <w:rPr>
+          <w:rFonts w:ascii="Calibri" w:hAnsi="Calibri"/>
+          <w:sz w:val="24"/>
+        </w:rPr>
+        <w:t>a ligne est sélectionnée et clignote en rouge, le bouton lecture devient orange.</w:t>
       </w:r>
     </w:p>
     <w:p>
@@ -9647,64 +9606,30 @@
       <w:r>
         <w:rPr>
           <w:rFonts w:ascii="Calibri" w:hAnsi="Calibri"/>
-          <w:noProof/>
-          <w:sz w:val="24"/>
-        </w:rPr>
-        <w:drawing>
-          <wp:anchor distT="0" distB="0" distL="114300" distR="114300" simplePos="0" relativeHeight="251659264" behindDoc="0" locked="0" layoutInCell="1" allowOverlap="1" wp14:anchorId="5A70DFD0" wp14:editId="37B3860A">
-            <wp:simplePos x="0" y="0"/>
-            <wp:positionH relativeFrom="column">
-              <wp:posOffset>4689475</wp:posOffset>
-            </wp:positionH>
-            <wp:positionV relativeFrom="paragraph">
-              <wp:posOffset>5080</wp:posOffset>
-            </wp:positionV>
-            <wp:extent cx="301905" cy="206062"/>
-            <wp:effectExtent l="0" t="0" r="3175" b="3810"/>
-            <wp:wrapNone/>
-            <wp:docPr id="2032195051" name="Image 1"/>
-            <wp:cNvGraphicFramePr>
-              <a:graphicFrameLocks xmlns:a="http://schemas.openxmlformats.org/drawingml/2006/main" noChangeAspect="1"/>
-            </wp:cNvGraphicFramePr>
-            <a:graphic xmlns:a="http://schemas.openxmlformats.org/drawingml/2006/main">
-              <a:graphicData uri="http://schemas.openxmlformats.org/drawingml/2006/picture">
-                <pic:pic xmlns:pic="http://schemas.openxmlformats.org/drawingml/2006/picture">
-                  <pic:nvPicPr>
-                    <pic:cNvPr id="2032195051" name=""/>
-                    <pic:cNvPicPr/>
-                  </pic:nvPicPr>
-                  <pic:blipFill>
-                    <a:blip r:embed="rId17">
-                      <a:extLst>
-                        <a:ext uri="{28A0092B-C50C-407E-A947-70E740481C1C}">
-                          <a14:useLocalDpi xmlns:a14="http://schemas.microsoft.com/office/drawing/2010/main" val="0"/>
-                        </a:ext>
-                      </a:extLst>
-                    </a:blip>
-                    <a:stretch>
-                      <a:fillRect/>
-                    </a:stretch>
-                  </pic:blipFill>
-                  <pic:spPr>
-                    <a:xfrm>
-                      <a:off x="0" y="0"/>
-                      <a:ext cx="301905" cy="206062"/>
-                    </a:xfrm>
-                    <a:prstGeom prst="rect">
-                      <a:avLst/>
-                    </a:prstGeom>
-                  </pic:spPr>
-                </pic:pic>
-              </a:graphicData>
-            </a:graphic>
-            <wp14:sizeRelH relativeFrom="margin">
-              <wp14:pctWidth>0</wp14:pctWidth>
-            </wp14:sizeRelH>
-            <wp14:sizeRelV relativeFrom="margin">
-              <wp14:pctHeight>0</wp14:pctHeight>
-            </wp14:sizeRelV>
-          </wp:anchor>
-        </w:drawing>
+          <w:sz w:val="24"/>
+        </w:rPr>
+        <w:t xml:space="preserve">  Pour démarrer le défilement, toucher la ligne sélectionnée (clignotante) dans la fiche train. Le bouton indicateur redevient alors vert.</w:t>
+      </w:r>
+    </w:p>
+    <w:p>
+      <w:pPr>
+        <w:pStyle w:val="Textebrut"/>
+        <w:numPr>
+          <w:ilvl w:val="2"/>
+          <w:numId w:val="38"/>
+        </w:numPr>
+        <w:jc w:val="both"/>
+        <w:rPr>
+          <w:rFonts w:ascii="Calibri" w:hAnsi="Calibri"/>
+          <w:sz w:val="24"/>
+        </w:rPr>
+      </w:pPr>
+      <w:r>
+        <w:rPr>
+          <w:rFonts w:ascii="Calibri" w:hAnsi="Calibri"/>
+          <w:sz w:val="24"/>
+        </w:rPr>
+        <w:t xml:space="preserve">  Une fois le parcours lancé, le bouton lecture reste visible mais n'est plus cliquable. Il sert uniquement d'indicateur </w:t>
       </w:r>
       <w:proofErr w:type="gramStart"/>
       <w:r>
@@ -9712,15 +9637,31 @@
           <w:rFonts w:ascii="Calibri" w:hAnsi="Calibri"/>
           <w:sz w:val="24"/>
         </w:rPr>
-        <w:t>le</w:t>
-      </w:r>
+        <w:t>d'</w:t>
+      </w:r>
+      <w:proofErr w:type="spellStart"/>
+      <w:r>
+        <w:rPr>
+          <w:rFonts w:ascii="Calibri" w:hAnsi="Calibri"/>
+          <w:sz w:val="24"/>
+        </w:rPr>
+        <w:t>état.</w:t>
+      </w:r>
+      <w:r>
+        <w:rPr>
+          <w:rFonts w:ascii="Calibri" w:hAnsi="Calibri"/>
+          <w:sz w:val="24"/>
+        </w:rPr>
+        <w:t>devient</w:t>
+      </w:r>
+      <w:proofErr w:type="spellEnd"/>
       <w:proofErr w:type="gramEnd"/>
       <w:r>
         <w:rPr>
           <w:rFonts w:ascii="Calibri" w:hAnsi="Calibri"/>
           <w:sz w:val="24"/>
         </w:rPr>
-        <w:t xml:space="preserve"> bouton devient vert, indiquant que le mode conduite est actif.</w:t>
+        <w:t xml:space="preserve"> vert, indiquant que le mode conduite est actif.</w:t>
       </w:r>
     </w:p>
     <w:p>
@@ -9749,6 +9690,16 @@
         </w:rPr>
         <w:t>L’activation du mode conduite déclenche le défilement automatique de la fiche train.</w:t>
       </w:r>
+    </w:p>
+    <w:p>
+      <w:pPr>
+        <w:pStyle w:val="Textebrut"/>
+        <w:jc w:val="both"/>
+        <w:rPr>
+          <w:rFonts w:ascii="Calibri" w:hAnsi="Calibri"/>
+          <w:sz w:val="24"/>
+        </w:rPr>
+      </w:pPr>
     </w:p>
     <w:p>
       <w:pPr>
@@ -9831,7 +9782,7 @@
                     <pic:cNvPicPr/>
                   </pic:nvPicPr>
                   <pic:blipFill>
-                    <a:blip r:embed="rId18"/>
+                    <a:blip r:embed="rId16"/>
                     <a:stretch>
                       <a:fillRect/>
                     </a:stretch>
@@ -9901,7 +9852,7 @@
                     <pic:cNvPicPr/>
                   </pic:nvPicPr>
                   <pic:blipFill>
-                    <a:blip r:embed="rId19"/>
+                    <a:blip r:embed="rId17"/>
                     <a:stretch>
                       <a:fillRect/>
                     </a:stretch>
@@ -9979,7 +9930,7 @@
                     <pic:cNvPicPr/>
                   </pic:nvPicPr>
                   <pic:blipFill rotWithShape="1">
-                    <a:blip r:embed="rId20"/>
+                    <a:blip r:embed="rId18"/>
                     <a:srcRect l="17254" t="23002" r="17120" b="23602"/>
                     <a:stretch>
                       <a:fillRect/>
@@ -10200,21 +10151,12 @@
           <w:sz w:val="24"/>
         </w:rPr>
       </w:pPr>
-    </w:p>
-    <w:p>
-      <w:pPr>
-        <w:pStyle w:val="Textebrut"/>
-        <w:jc w:val="both"/>
-        <w:rPr>
-          <w:rFonts w:ascii="Calibri" w:hAnsi="Calibri"/>
-          <w:sz w:val="24"/>
-        </w:rPr>
-      </w:pPr>
-      <w:r>
-        <w:rPr>
-          <w:rFonts w:ascii="Calibri" w:hAnsi="Calibri"/>
-          <w:sz w:val="24"/>
-        </w:rPr>
+      <w:r>
+        <w:rPr>
+          <w:rFonts w:ascii="Calibri" w:hAnsi="Calibri"/>
+          <w:sz w:val="24"/>
+        </w:rPr>
+        <w:lastRenderedPageBreak/>
         <w:t>Les états principaux sont les suivants :</w:t>
       </w:r>
     </w:p>
@@ -10253,7 +10195,7 @@
                     <pic:cNvPicPr/>
                   </pic:nvPicPr>
                   <pic:blipFill>
-                    <a:blip r:embed="rId21"/>
+                    <a:blip r:embed="rId19"/>
                     <a:stretch>
                       <a:fillRect/>
                     </a:stretch>
@@ -10323,7 +10265,7 @@
                     <pic:cNvPicPr/>
                   </pic:nvPicPr>
                   <pic:blipFill>
-                    <a:blip r:embed="rId22"/>
+                    <a:blip r:embed="rId20"/>
                     <a:stretch>
                       <a:fillRect/>
                     </a:stretch>
@@ -10393,7 +10335,7 @@
                     <pic:cNvPicPr/>
                   </pic:nvPicPr>
                   <pic:blipFill>
-                    <a:blip r:embed="rId23"/>
+                    <a:blip r:embed="rId21"/>
                     <a:stretch>
                       <a:fillRect/>
                     </a:stretch>
@@ -10452,7 +10394,6 @@
           <w:rFonts w:ascii="Calibri" w:hAnsi="Calibri"/>
           <w:sz w:val="24"/>
         </w:rPr>
-        <w:lastRenderedPageBreak/>
         <w:t xml:space="preserve">Lorsque le GPS est exploitable, l’application privilégie le suivi GPS. </w:t>
       </w:r>
     </w:p>
@@ -10901,7 +10842,7 @@
                     <pic:cNvPicPr/>
                   </pic:nvPicPr>
                   <pic:blipFill rotWithShape="1">
-                    <a:blip r:embed="rId20"/>
+                    <a:blip r:embed="rId18"/>
                     <a:srcRect l="17721" t="18862" r="16551" b="20975"/>
                     <a:stretch>
                       <a:fillRect/>
@@ -11132,7 +11073,7 @@
                     <pic:cNvPicPr/>
                   </pic:nvPicPr>
                   <pic:blipFill>
-                    <a:blip r:embed="rId24"/>
+                    <a:blip r:embed="rId22"/>
                     <a:stretch>
                       <a:fillRect/>
                     </a:stretch>
@@ -11271,7 +11212,7 @@
                     <pic:cNvPicPr/>
                   </pic:nvPicPr>
                   <pic:blipFill>
-                    <a:blip r:embed="rId25"/>
+                    <a:blip r:embed="rId23"/>
                     <a:stretch>
                       <a:fillRect/>
                     </a:stretch>
@@ -11489,7 +11430,7 @@
                     <pic:cNvPicPr/>
                   </pic:nvPicPr>
                   <pic:blipFill>
-                    <a:blip r:embed="rId26" cstate="print">
+                    <a:blip r:embed="rId24" cstate="print">
                       <a:extLst>
                         <a:ext uri="{28A0092B-C50C-407E-A947-70E740481C1C}">
                           <a14:useLocalDpi xmlns:a14="http://schemas.microsoft.com/office/drawing/2010/main" val="0"/>
@@ -11597,7 +11538,7 @@
                     <pic:cNvPicPr/>
                   </pic:nvPicPr>
                   <pic:blipFill>
-                    <a:blip r:embed="rId27" cstate="print">
+                    <a:blip r:embed="rId25" cstate="print">
                       <a:extLst>
                         <a:ext uri="{28A0092B-C50C-407E-A947-70E740481C1C}">
                           <a14:useLocalDpi xmlns:a14="http://schemas.microsoft.com/office/drawing/2010/main" val="0"/>
@@ -11630,7 +11571,7 @@
           <w:sz w:val="24"/>
         </w:rPr>
         <w:drawing>
-          <wp:anchor distT="0" distB="0" distL="114300" distR="114300" simplePos="0" relativeHeight="251663360" behindDoc="0" locked="0" layoutInCell="1" allowOverlap="1" wp14:anchorId="0E0D3AE5" wp14:editId="58034D38">
+          <wp:anchor distT="0" distB="0" distL="114300" distR="114300" simplePos="0" relativeHeight="251663360" behindDoc="0" locked="0" layoutInCell="1" allowOverlap="1" wp14:anchorId="0E0D3AE5" wp14:editId="1226DB6C">
             <wp:simplePos x="0" y="0"/>
             <wp:positionH relativeFrom="column">
               <wp:posOffset>3001433</wp:posOffset>
@@ -11653,7 +11594,7 @@
                     <pic:cNvPicPr/>
                   </pic:nvPicPr>
                   <pic:blipFill>
-                    <a:blip r:embed="rId19" cstate="print">
+                    <a:blip r:embed="rId17" cstate="print">
                       <a:extLst>
                         <a:ext uri="{28A0092B-C50C-407E-A947-70E740481C1C}">
                           <a14:useLocalDpi xmlns:a14="http://schemas.microsoft.com/office/drawing/2010/main" val="0"/>
@@ -12085,7 +12026,7 @@
                     <pic:cNvPicPr/>
                   </pic:nvPicPr>
                   <pic:blipFill>
-                    <a:blip r:embed="rId28"/>
+                    <a:blip r:embed="rId26"/>
                     <a:stretch>
                       <a:fillRect/>
                     </a:stretch>
@@ -12136,7 +12077,7 @@
           <w:sz w:val="24"/>
         </w:rPr>
         <w:drawing>
-          <wp:anchor distT="0" distB="0" distL="114300" distR="114300" simplePos="0" relativeHeight="251666432" behindDoc="0" locked="0" layoutInCell="1" allowOverlap="1" wp14:anchorId="7F6D1FB8" wp14:editId="224C2025">
+          <wp:anchor distT="0" distB="0" distL="114300" distR="114300" simplePos="0" relativeHeight="251666432" behindDoc="0" locked="0" layoutInCell="1" allowOverlap="1" wp14:anchorId="7F6D1FB8" wp14:editId="6CF8717E">
             <wp:simplePos x="0" y="0"/>
             <wp:positionH relativeFrom="column">
               <wp:posOffset>3324098</wp:posOffset>
@@ -12159,7 +12100,7 @@
                     <pic:cNvPicPr/>
                   </pic:nvPicPr>
                   <pic:blipFill>
-                    <a:blip r:embed="rId29" cstate="print">
+                    <a:blip r:embed="rId27" cstate="print">
                       <a:extLst>
                         <a:ext uri="{28A0092B-C50C-407E-A947-70E740481C1C}">
                           <a14:useLocalDpi xmlns:a14="http://schemas.microsoft.com/office/drawing/2010/main" val="0"/>
@@ -12235,7 +12176,7 @@
                     <pic:cNvPicPr/>
                   </pic:nvPicPr>
                   <pic:blipFill>
-                    <a:blip r:embed="rId30" cstate="print">
+                    <a:blip r:embed="rId28" cstate="print">
                       <a:extLst>
                         <a:ext uri="{28A0092B-C50C-407E-A947-70E740481C1C}">
                           <a14:useLocalDpi xmlns:a14="http://schemas.microsoft.com/office/drawing/2010/main" val="0"/>
@@ -12402,169 +12343,61 @@
         <w:pStyle w:val="Textebrut"/>
         <w:numPr>
           <w:ilvl w:val="0"/>
-          <w:numId w:val="3"/>
+          <w:numId w:val="43"/>
         </w:numPr>
         <w:jc w:val="both"/>
         <w:rPr>
           <w:rFonts w:ascii="Calibri" w:hAnsi="Calibri"/>
-          <w:sz w:val="24"/>
-        </w:rPr>
-      </w:pPr>
-      <w:r>
-        <w:rPr>
-          <w:rFonts w:ascii="Calibri" w:hAnsi="Calibri"/>
           <w:noProof/>
           <w:sz w:val="24"/>
         </w:rPr>
-        <w:drawing>
-          <wp:anchor distT="0" distB="0" distL="114300" distR="114300" simplePos="0" relativeHeight="251668480" behindDoc="0" locked="0" layoutInCell="1" allowOverlap="1" wp14:anchorId="6B8E97BB" wp14:editId="021F26AE">
-            <wp:simplePos x="0" y="0"/>
-            <wp:positionH relativeFrom="column">
-              <wp:posOffset>4337473</wp:posOffset>
-            </wp:positionH>
-            <wp:positionV relativeFrom="paragraph">
-              <wp:posOffset>2117</wp:posOffset>
-            </wp:positionV>
-            <wp:extent cx="251460" cy="209550"/>
-            <wp:effectExtent l="0" t="0" r="0" b="0"/>
-            <wp:wrapNone/>
-            <wp:docPr id="364242484" name="Image 1"/>
-            <wp:cNvGraphicFramePr>
-              <a:graphicFrameLocks xmlns:a="http://schemas.openxmlformats.org/drawingml/2006/main" noChangeAspect="1"/>
-            </wp:cNvGraphicFramePr>
-            <a:graphic xmlns:a="http://schemas.openxmlformats.org/drawingml/2006/main">
-              <a:graphicData uri="http://schemas.openxmlformats.org/drawingml/2006/picture">
-                <pic:pic xmlns:pic="http://schemas.openxmlformats.org/drawingml/2006/picture">
-                  <pic:nvPicPr>
-                    <pic:cNvPr id="1978827841" name=""/>
-                    <pic:cNvPicPr/>
-                  </pic:nvPicPr>
-                  <pic:blipFill>
-                    <a:blip r:embed="rId29" cstate="print">
-                      <a:extLst>
-                        <a:ext uri="{28A0092B-C50C-407E-A947-70E740481C1C}">
-                          <a14:useLocalDpi xmlns:a14="http://schemas.microsoft.com/office/drawing/2010/main" val="0"/>
-                        </a:ext>
-                      </a:extLst>
-                    </a:blip>
-                    <a:stretch>
-                      <a:fillRect/>
-                    </a:stretch>
-                  </pic:blipFill>
-                  <pic:spPr>
-                    <a:xfrm>
-                      <a:off x="0" y="0"/>
-                      <a:ext cx="251460" cy="209550"/>
-                    </a:xfrm>
-                    <a:prstGeom prst="rect">
-                      <a:avLst/>
-                    </a:prstGeom>
-                  </pic:spPr>
-                </pic:pic>
-              </a:graphicData>
-            </a:graphic>
-            <wp14:sizeRelH relativeFrom="margin">
-              <wp14:pctWidth>0</wp14:pctWidth>
-            </wp14:sizeRelH>
-            <wp14:sizeRelV relativeFrom="margin">
-              <wp14:pctHeight>0</wp14:pctHeight>
-            </wp14:sizeRelV>
-          </wp:anchor>
-        </w:drawing>
-      </w:r>
-      <w:proofErr w:type="gramStart"/>
-      <w:r>
-        <w:rPr>
-          <w:rFonts w:ascii="Calibri" w:hAnsi="Calibri"/>
-          <w:sz w:val="24"/>
-        </w:rPr>
-        <w:t>toucher</w:t>
-      </w:r>
-      <w:proofErr w:type="gramEnd"/>
-      <w:r>
-        <w:rPr>
-          <w:rFonts w:ascii="Calibri" w:hAnsi="Calibri"/>
-          <w:sz w:val="24"/>
-        </w:rPr>
-        <w:t xml:space="preserve"> le bouton lecture/reprise dans la barre supérieure.</w:t>
-      </w:r>
-    </w:p>
-    <w:p>
-      <w:pPr>
-        <w:pStyle w:val="Textebrut"/>
-        <w:jc w:val="both"/>
-        <w:rPr>
-          <w:rFonts w:ascii="Calibri" w:hAnsi="Calibri"/>
-          <w:sz w:val="24"/>
-        </w:rPr>
-      </w:pPr>
-    </w:p>
-    <w:p>
-      <w:pPr>
-        <w:pStyle w:val="Textebrut"/>
-        <w:jc w:val="both"/>
-        <w:rPr>
-          <w:rFonts w:ascii="Calibri" w:hAnsi="Calibri"/>
-          <w:sz w:val="24"/>
-        </w:rPr>
-      </w:pPr>
-      <w:r>
-        <w:rPr>
-          <w:rFonts w:ascii="Calibri" w:hAnsi="Calibri"/>
-          <w:sz w:val="24"/>
-        </w:rPr>
-        <w:t xml:space="preserve">Le bouton, qui était </w:t>
-      </w:r>
-      <w:r>
-        <w:rPr>
-          <w:rFonts w:ascii="Calibri" w:hAnsi="Calibri"/>
-          <w:b/>
-          <w:sz w:val="24"/>
-        </w:rPr>
-        <w:t>orange</w:t>
-      </w:r>
-      <w:r>
-        <w:rPr>
-          <w:rFonts w:ascii="Calibri" w:hAnsi="Calibri"/>
-          <w:sz w:val="24"/>
-        </w:rPr>
-        <w:t xml:space="preserve"> en mode standby, redevient </w:t>
-      </w:r>
-      <w:r>
-        <w:rPr>
-          <w:rFonts w:ascii="Calibri" w:hAnsi="Calibri"/>
-          <w:b/>
-          <w:sz w:val="24"/>
-        </w:rPr>
-        <w:t>vert</w:t>
-      </w:r>
-      <w:r>
-        <w:rPr>
-          <w:rFonts w:ascii="Calibri" w:hAnsi="Calibri"/>
-          <w:sz w:val="24"/>
-        </w:rPr>
-        <w:t xml:space="preserve"> lorsque le défilement reprend.</w:t>
-      </w:r>
-    </w:p>
-    <w:p>
-      <w:pPr>
-        <w:pStyle w:val="Textebrut"/>
-        <w:jc w:val="both"/>
-        <w:rPr>
-          <w:rFonts w:ascii="Calibri" w:hAnsi="Calibri"/>
-          <w:sz w:val="24"/>
-        </w:rPr>
-      </w:pPr>
-    </w:p>
-    <w:p>
-      <w:pPr>
-        <w:pStyle w:val="Textebrut"/>
-        <w:jc w:val="both"/>
-        <w:rPr>
-          <w:rFonts w:ascii="Calibri" w:hAnsi="Calibri"/>
-          <w:sz w:val="24"/>
-        </w:rPr>
-      </w:pPr>
+      </w:pPr>
+      <w:r>
+        <w:rPr>
+          <w:rFonts w:ascii="Calibri" w:hAnsi="Calibri"/>
+          <w:noProof/>
+          <w:sz w:val="24"/>
+        </w:rPr>
+        <w:t>toucher à nouveau la ligne sélectionnée (clignotante en rouge) dans la fiche train.</w:t>
+      </w:r>
+    </w:p>
+    <w:p>
+      <w:pPr>
+        <w:pStyle w:val="Textebrut"/>
+        <w:ind w:left="720"/>
+        <w:jc w:val="both"/>
+        <w:rPr>
+          <w:rFonts w:ascii="Calibri" w:hAnsi="Calibri"/>
+          <w:noProof/>
+          <w:sz w:val="24"/>
+        </w:rPr>
+      </w:pPr>
+    </w:p>
+    <w:p>
+      <w:pPr>
+        <w:pStyle w:val="Textebrut"/>
+        <w:jc w:val="both"/>
+        <w:rPr>
+          <w:rFonts w:ascii="Calibri" w:hAnsi="Calibri"/>
+          <w:sz w:val="24"/>
+        </w:rPr>
+      </w:pPr>
+      <w:r>
+        <w:rPr>
+          <w:rFonts w:ascii="Calibri" w:hAnsi="Calibri"/>
+          <w:noProof/>
+          <w:sz w:val="24"/>
+        </w:rPr>
+        <w:t>Le bouton indicateur, qui était orange en mode standby, redevient vert lorsque le défilement reprend.</w:t>
+      </w:r>
+      <w:r>
+        <w:rPr>
+          <w:rFonts w:ascii="Calibri" w:hAnsi="Calibri"/>
+          <w:noProof/>
+          <w:sz w:val="24"/>
+        </w:rPr>
+        <w:t xml:space="preserve"> </w:t>
+      </w:r>
       <w:r>
         <w:rPr>
           <w:rFonts w:ascii="Calibri" w:hAnsi="Calibri"/>
@@ -12865,8 +12698,8 @@
       <w:pPr>
         <w:pStyle w:val="Textebrut"/>
         <w:numPr>
-          <w:ilvl w:val="1"/>
-          <w:numId w:val="5"/>
+          <w:ilvl w:val="0"/>
+          <w:numId w:val="43"/>
         </w:numPr>
         <w:jc w:val="both"/>
         <w:rPr>
@@ -12874,6 +12707,44 @@
           <w:sz w:val="24"/>
         </w:rPr>
       </w:pPr>
+      <w:proofErr w:type="gramStart"/>
+      <w:r>
+        <w:rPr>
+          <w:rFonts w:ascii="Calibri" w:hAnsi="Calibri"/>
+          <w:sz w:val="24"/>
+        </w:rPr>
+        <w:t>toucher</w:t>
+      </w:r>
+      <w:proofErr w:type="gramEnd"/>
+      <w:r>
+        <w:rPr>
+          <w:rFonts w:ascii="Calibri" w:hAnsi="Calibri"/>
+          <w:sz w:val="24"/>
+        </w:rPr>
+        <w:t xml:space="preserve"> la ligne de gare sélectionnée (clignotante en rouge) dans la fiche train.</w:t>
+      </w:r>
+    </w:p>
+    <w:p>
+      <w:pPr>
+        <w:pStyle w:val="Textebrut"/>
+        <w:ind w:left="720"/>
+        <w:jc w:val="both"/>
+        <w:rPr>
+          <w:rFonts w:ascii="Calibri" w:hAnsi="Calibri"/>
+          <w:sz w:val="24"/>
+        </w:rPr>
+      </w:pPr>
+    </w:p>
+    <w:p>
+      <w:pPr>
+        <w:pStyle w:val="Textebrut"/>
+        <w:ind w:left="720" w:hanging="720"/>
+        <w:jc w:val="both"/>
+        <w:rPr>
+          <w:rFonts w:ascii="Calibri" w:hAnsi="Calibri"/>
+          <w:sz w:val="24"/>
+        </w:rPr>
+      </w:pPr>
       <w:r>
         <w:rPr>
           <w:rFonts w:ascii="Calibri" w:hAnsi="Calibri"/>
@@ -12881,108 +12752,13 @@
           <w:sz w:val="24"/>
         </w:rPr>
         <w:drawing>
-          <wp:anchor distT="0" distB="0" distL="114300" distR="114300" simplePos="0" relativeHeight="251669504" behindDoc="0" locked="0" layoutInCell="1" allowOverlap="1" wp14:anchorId="00EBFE11" wp14:editId="4A107218">
+          <wp:anchor distT="0" distB="0" distL="114300" distR="114300" simplePos="0" relativeHeight="251670528" behindDoc="0" locked="0" layoutInCell="1" allowOverlap="1" wp14:anchorId="2F276371" wp14:editId="5E651A04">
             <wp:simplePos x="0" y="0"/>
             <wp:positionH relativeFrom="column">
-              <wp:posOffset>4154805</wp:posOffset>
+              <wp:posOffset>2578946</wp:posOffset>
             </wp:positionH>
             <wp:positionV relativeFrom="paragraph">
-              <wp:posOffset>5291</wp:posOffset>
-            </wp:positionV>
-            <wp:extent cx="262983" cy="219153"/>
-            <wp:effectExtent l="0" t="0" r="3810" b="9525"/>
-            <wp:wrapNone/>
-            <wp:docPr id="90262615" name="Image 1"/>
-            <wp:cNvGraphicFramePr>
-              <a:graphicFrameLocks xmlns:a="http://schemas.openxmlformats.org/drawingml/2006/main" noChangeAspect="1"/>
-            </wp:cNvGraphicFramePr>
-            <a:graphic xmlns:a="http://schemas.openxmlformats.org/drawingml/2006/main">
-              <a:graphicData uri="http://schemas.openxmlformats.org/drawingml/2006/picture">
-                <pic:pic xmlns:pic="http://schemas.openxmlformats.org/drawingml/2006/picture">
-                  <pic:nvPicPr>
-                    <pic:cNvPr id="1978827841" name=""/>
-                    <pic:cNvPicPr/>
-                  </pic:nvPicPr>
-                  <pic:blipFill>
-                    <a:blip r:embed="rId31" cstate="print">
-                      <a:extLst>
-                        <a:ext uri="{28A0092B-C50C-407E-A947-70E740481C1C}">
-                          <a14:useLocalDpi xmlns:a14="http://schemas.microsoft.com/office/drawing/2010/main" val="0"/>
-                        </a:ext>
-                      </a:extLst>
-                    </a:blip>
-                    <a:stretch>
-                      <a:fillRect/>
-                    </a:stretch>
-                  </pic:blipFill>
-                  <pic:spPr>
-                    <a:xfrm>
-                      <a:off x="0" y="0"/>
-                      <a:ext cx="262983" cy="219153"/>
-                    </a:xfrm>
-                    <a:prstGeom prst="rect">
-                      <a:avLst/>
-                    </a:prstGeom>
-                  </pic:spPr>
-                </pic:pic>
-              </a:graphicData>
-            </a:graphic>
-            <wp14:sizeRelH relativeFrom="margin">
-              <wp14:pctWidth>0</wp14:pctWidth>
-            </wp14:sizeRelH>
-            <wp14:sizeRelV relativeFrom="margin">
-              <wp14:pctHeight>0</wp14:pctHeight>
-            </wp14:sizeRelV>
-          </wp:anchor>
-        </w:drawing>
-      </w:r>
-      <w:proofErr w:type="gramStart"/>
-      <w:r>
-        <w:rPr>
-          <w:rFonts w:ascii="Calibri" w:hAnsi="Calibri"/>
-          <w:sz w:val="24"/>
-        </w:rPr>
-        <w:t>toucher</w:t>
-      </w:r>
-      <w:proofErr w:type="gramEnd"/>
-      <w:r>
-        <w:rPr>
-          <w:rFonts w:ascii="Calibri" w:hAnsi="Calibri"/>
-          <w:sz w:val="24"/>
-        </w:rPr>
-        <w:t xml:space="preserve"> le bouton </w:t>
-      </w:r>
-      <w:r>
-        <w:rPr>
-          <w:rFonts w:ascii="Calibri" w:hAnsi="Calibri"/>
-          <w:sz w:val="24"/>
-        </w:rPr>
-        <w:t>lecture/reprise dans la barre supérieure.</w:t>
-      </w:r>
-    </w:p>
-    <w:p>
-      <w:pPr>
-        <w:pStyle w:val="Textebrut"/>
-        <w:jc w:val="both"/>
-        <w:rPr>
-          <w:rFonts w:ascii="Calibri" w:hAnsi="Calibri"/>
-          <w:sz w:val="24"/>
-        </w:rPr>
-      </w:pPr>
-      <w:r>
-        <w:rPr>
-          <w:rFonts w:ascii="Calibri" w:hAnsi="Calibri"/>
-          <w:noProof/>
-          <w:sz w:val="24"/>
-        </w:rPr>
-        <w:drawing>
-          <wp:anchor distT="0" distB="0" distL="114300" distR="114300" simplePos="0" relativeHeight="251670528" behindDoc="0" locked="0" layoutInCell="1" allowOverlap="1" wp14:anchorId="2F276371" wp14:editId="0ED6CFAD">
-            <wp:simplePos x="0" y="0"/>
-            <wp:positionH relativeFrom="column">
-              <wp:posOffset>1897591</wp:posOffset>
-            </wp:positionH>
-            <wp:positionV relativeFrom="paragraph">
-              <wp:posOffset>176742</wp:posOffset>
+              <wp:posOffset>7408</wp:posOffset>
             </wp:positionV>
             <wp:extent cx="313503" cy="213978"/>
             <wp:effectExtent l="0" t="0" r="0" b="0"/>
@@ -12999,7 +12775,7 @@
                     <pic:cNvPicPr/>
                   </pic:nvPicPr>
                   <pic:blipFill>
-                    <a:blip r:embed="rId17">
+                    <a:blip r:embed="rId29">
                       <a:extLst>
                         <a:ext uri="{28A0092B-C50C-407E-A947-70E740481C1C}">
                           <a14:useLocalDpi xmlns:a14="http://schemas.microsoft.com/office/drawing/2010/main" val="0"/>
@@ -13031,22 +12807,19 @@
           </wp:anchor>
         </w:drawing>
       </w:r>
-    </w:p>
-    <w:p>
-      <w:pPr>
-        <w:pStyle w:val="Textebrut"/>
-        <w:jc w:val="both"/>
-        <w:rPr>
-          <w:rFonts w:ascii="Calibri" w:hAnsi="Calibri"/>
-          <w:sz w:val="24"/>
-        </w:rPr>
-      </w:pPr>
       <w:r>
         <w:rPr>
           <w:rFonts w:ascii="Calibri" w:hAnsi="Calibri"/>
           <w:sz w:val="24"/>
         </w:rPr>
         <w:t xml:space="preserve">Le bouton </w:t>
+      </w:r>
+      <w:r>
+        <w:rPr>
+          <w:rFonts w:ascii="Calibri" w:hAnsi="Calibri"/>
+          <w:sz w:val="24"/>
+        </w:rPr>
+        <w:t xml:space="preserve">indicateur </w:t>
       </w:r>
       <w:r>
         <w:rPr>
@@ -13296,7 +13069,7 @@
                     <pic:cNvPicPr/>
                   </pic:nvPicPr>
                   <pic:blipFill>
-                    <a:blip r:embed="rId32"/>
+                    <a:blip r:embed="rId30"/>
                     <a:stretch>
                       <a:fillRect/>
                     </a:stretch>
@@ -13529,7 +13302,7 @@
                     <pic:cNvPicPr/>
                   </pic:nvPicPr>
                   <pic:blipFill>
-                    <a:blip r:embed="rId33"/>
+                    <a:blip r:embed="rId31"/>
                     <a:stretch>
                       <a:fillRect/>
                     </a:stretch>
@@ -13698,7 +13471,7 @@
           <w:sz w:val="24"/>
         </w:rPr>
         <w:drawing>
-          <wp:anchor distT="0" distB="0" distL="114300" distR="114300" simplePos="0" relativeHeight="251671552" behindDoc="0" locked="0" layoutInCell="1" allowOverlap="1" wp14:anchorId="177368A4" wp14:editId="59D86D75">
+          <wp:anchor distT="0" distB="0" distL="114300" distR="114300" simplePos="0" relativeHeight="251671552" behindDoc="0" locked="0" layoutInCell="1" allowOverlap="1" wp14:anchorId="177368A4" wp14:editId="78532E53">
             <wp:simplePos x="0" y="0"/>
             <wp:positionH relativeFrom="column">
               <wp:posOffset>3133691</wp:posOffset>
@@ -13721,7 +13494,7 @@
                     <pic:cNvPicPr/>
                   </pic:nvPicPr>
                   <pic:blipFill>
-                    <a:blip r:embed="rId34" cstate="print">
+                    <a:blip r:embed="rId32" cstate="print">
                       <a:extLst>
                         <a:ext uri="{28A0092B-C50C-407E-A947-70E740481C1C}">
                           <a14:useLocalDpi xmlns:a14="http://schemas.microsoft.com/office/drawing/2010/main" val="0"/>
@@ -13797,7 +13570,7 @@
                     <pic:cNvPicPr/>
                   </pic:nvPicPr>
                   <pic:blipFill>
-                    <a:blip r:embed="rId35" cstate="print">
+                    <a:blip r:embed="rId33" cstate="print">
                       <a:extLst>
                         <a:ext uri="{28A0092B-C50C-407E-A947-70E740481C1C}">
                           <a14:useLocalDpi xmlns:a14="http://schemas.microsoft.com/office/drawing/2010/main" val="0"/>
@@ -14027,7 +13800,7 @@
                     <pic:cNvPicPr/>
                   </pic:nvPicPr>
                   <pic:blipFill>
-                    <a:blip r:embed="rId36"/>
+                    <a:blip r:embed="rId34"/>
                     <a:stretch>
                       <a:fillRect/>
                     </a:stretch>
@@ -14126,7 +13899,7 @@
                     <pic:cNvPicPr/>
                   </pic:nvPicPr>
                   <pic:blipFill>
-                    <a:blip r:embed="rId37"/>
+                    <a:blip r:embed="rId35"/>
                     <a:stretch>
                       <a:fillRect/>
                     </a:stretch>
@@ -14262,7 +14035,7 @@
                     <pic:cNvPicPr/>
                   </pic:nvPicPr>
                   <pic:blipFill>
-                    <a:blip r:embed="rId38"/>
+                    <a:blip r:embed="rId36"/>
                     <a:stretch>
                       <a:fillRect/>
                     </a:stretch>
@@ -14347,7 +14120,7 @@
                     <pic:cNvPicPr/>
                   </pic:nvPicPr>
                   <pic:blipFill>
-                    <a:blip r:embed="rId25"/>
+                    <a:blip r:embed="rId23"/>
                     <a:stretch>
                       <a:fillRect/>
                     </a:stretch>
@@ -14634,7 +14407,7 @@
                     <pic:cNvPicPr/>
                   </pic:nvPicPr>
                   <pic:blipFill>
-                    <a:blip r:embed="rId39"/>
+                    <a:blip r:embed="rId37"/>
                     <a:stretch>
                       <a:fillRect/>
                     </a:stretch>
@@ -14867,7 +14640,7 @@
                     <pic:cNvPicPr/>
                   </pic:nvPicPr>
                   <pic:blipFill>
-                    <a:blip r:embed="rId40"/>
+                    <a:blip r:embed="rId38"/>
                     <a:stretch>
                       <a:fillRect/>
                     </a:stretch>
@@ -14978,7 +14751,7 @@
       </w:r>
     </w:p>
     <w:sectPr>
-      <w:footerReference w:type="default" r:id="rId41"/>
+      <w:footerReference w:type="default" r:id="rId39"/>
       <w:pgSz w:w="11906" w:h="16838"/>
       <w:pgMar w:top="1417" w:right="1335" w:bottom="1417" w:left="1334" w:header="708" w:footer="708" w:gutter="0"/>
       <w:cols w:space="708"/>
@@ -16010,6 +15783,119 @@
     </w:lvl>
   </w:abstractNum>
   <w:abstractNum w:abstractNumId="7" w15:restartNumberingAfterBreak="0">
+    <w:nsid w:val="1EC23BF1"/>
+    <w:multiLevelType w:val="hybridMultilevel"/>
+    <w:tmpl w:val="38D830DA"/>
+    <w:lvl w:ilvl="0" w:tplc="FFFFFFFF">
+      <w:start w:val="1"/>
+      <w:numFmt w:val="bullet"/>
+      <w:lvlText w:val=""/>
+      <w:lvlJc w:val="left"/>
+      <w:pPr>
+        <w:ind w:left="720" w:hanging="360"/>
+      </w:pPr>
+      <w:rPr>
+        <w:rFonts w:ascii="Symbol" w:hAnsi="Symbol" w:hint="default"/>
+      </w:rPr>
+    </w:lvl>
+    <w:lvl w:ilvl="1" w:tplc="040C0003" w:tentative="1">
+      <w:start w:val="1"/>
+      <w:numFmt w:val="bullet"/>
+      <w:lvlText w:val="o"/>
+      <w:lvlJc w:val="left"/>
+      <w:pPr>
+        <w:ind w:left="1440" w:hanging="360"/>
+      </w:pPr>
+      <w:rPr>
+        <w:rFonts w:ascii="Courier New" w:hAnsi="Courier New" w:cs="Courier New" w:hint="default"/>
+      </w:rPr>
+    </w:lvl>
+    <w:lvl w:ilvl="2" w:tplc="040C0005" w:tentative="1">
+      <w:start w:val="1"/>
+      <w:numFmt w:val="bullet"/>
+      <w:lvlText w:val=""/>
+      <w:lvlJc w:val="left"/>
+      <w:pPr>
+        <w:ind w:left="2160" w:hanging="360"/>
+      </w:pPr>
+      <w:rPr>
+        <w:rFonts w:ascii="Wingdings" w:hAnsi="Wingdings" w:hint="default"/>
+      </w:rPr>
+    </w:lvl>
+    <w:lvl w:ilvl="3" w:tplc="040C0001" w:tentative="1">
+      <w:start w:val="1"/>
+      <w:numFmt w:val="bullet"/>
+      <w:lvlText w:val=""/>
+      <w:lvlJc w:val="left"/>
+      <w:pPr>
+        <w:ind w:left="2880" w:hanging="360"/>
+      </w:pPr>
+      <w:rPr>
+        <w:rFonts w:ascii="Symbol" w:hAnsi="Symbol" w:hint="default"/>
+      </w:rPr>
+    </w:lvl>
+    <w:lvl w:ilvl="4" w:tplc="040C0003" w:tentative="1">
+      <w:start w:val="1"/>
+      <w:numFmt w:val="bullet"/>
+      <w:lvlText w:val="o"/>
+      <w:lvlJc w:val="left"/>
+      <w:pPr>
+        <w:ind w:left="3600" w:hanging="360"/>
+      </w:pPr>
+      <w:rPr>
+        <w:rFonts w:ascii="Courier New" w:hAnsi="Courier New" w:cs="Courier New" w:hint="default"/>
+      </w:rPr>
+    </w:lvl>
+    <w:lvl w:ilvl="5" w:tplc="040C0005" w:tentative="1">
+      <w:start w:val="1"/>
+      <w:numFmt w:val="bullet"/>
+      <w:lvlText w:val=""/>
+      <w:lvlJc w:val="left"/>
+      <w:pPr>
+        <w:ind w:left="4320" w:hanging="360"/>
+      </w:pPr>
+      <w:rPr>
+        <w:rFonts w:ascii="Wingdings" w:hAnsi="Wingdings" w:hint="default"/>
+      </w:rPr>
+    </w:lvl>
+    <w:lvl w:ilvl="6" w:tplc="040C0001" w:tentative="1">
+      <w:start w:val="1"/>
+      <w:numFmt w:val="bullet"/>
+      <w:lvlText w:val=""/>
+      <w:lvlJc w:val="left"/>
+      <w:pPr>
+        <w:ind w:left="5040" w:hanging="360"/>
+      </w:pPr>
+      <w:rPr>
+        <w:rFonts w:ascii="Symbol" w:hAnsi="Symbol" w:hint="default"/>
+      </w:rPr>
+    </w:lvl>
+    <w:lvl w:ilvl="7" w:tplc="040C0003" w:tentative="1">
+      <w:start w:val="1"/>
+      <w:numFmt w:val="bullet"/>
+      <w:lvlText w:val="o"/>
+      <w:lvlJc w:val="left"/>
+      <w:pPr>
+        <w:ind w:left="5760" w:hanging="360"/>
+      </w:pPr>
+      <w:rPr>
+        <w:rFonts w:ascii="Courier New" w:hAnsi="Courier New" w:cs="Courier New" w:hint="default"/>
+      </w:rPr>
+    </w:lvl>
+    <w:lvl w:ilvl="8" w:tplc="040C0005" w:tentative="1">
+      <w:start w:val="1"/>
+      <w:numFmt w:val="bullet"/>
+      <w:lvlText w:val=""/>
+      <w:lvlJc w:val="left"/>
+      <w:pPr>
+        <w:ind w:left="6480" w:hanging="360"/>
+      </w:pPr>
+      <w:rPr>
+        <w:rFonts w:ascii="Wingdings" w:hAnsi="Wingdings" w:hint="default"/>
+      </w:rPr>
+    </w:lvl>
+  </w:abstractNum>
+  <w:abstractNum w:abstractNumId="8" w15:restartNumberingAfterBreak="0">
     <w:nsid w:val="1ED4546A"/>
     <w:multiLevelType w:val="hybridMultilevel"/>
     <w:tmpl w:val="75E0AE28"/>
@@ -16122,7 +16008,7 @@
       </w:rPr>
     </w:lvl>
   </w:abstractNum>
-  <w:abstractNum w:abstractNumId="8" w15:restartNumberingAfterBreak="0">
+  <w:abstractNum w:abstractNumId="9" w15:restartNumberingAfterBreak="0">
     <w:nsid w:val="1FB526C2"/>
     <w:multiLevelType w:val="hybridMultilevel"/>
     <w:tmpl w:val="BB6CB068"/>
@@ -16235,7 +16121,7 @@
       </w:rPr>
     </w:lvl>
   </w:abstractNum>
-  <w:abstractNum w:abstractNumId="9" w15:restartNumberingAfterBreak="0">
+  <w:abstractNum w:abstractNumId="10" w15:restartNumberingAfterBreak="0">
     <w:nsid w:val="20505DC5"/>
     <w:multiLevelType w:val="hybridMultilevel"/>
     <w:tmpl w:val="53A450E8"/>
@@ -16348,7 +16234,7 @@
       </w:rPr>
     </w:lvl>
   </w:abstractNum>
-  <w:abstractNum w:abstractNumId="10" w15:restartNumberingAfterBreak="0">
+  <w:abstractNum w:abstractNumId="11" w15:restartNumberingAfterBreak="0">
     <w:nsid w:val="26AD7BED"/>
     <w:multiLevelType w:val="hybridMultilevel"/>
     <w:tmpl w:val="40BE07FA"/>
@@ -16461,7 +16347,7 @@
       </w:rPr>
     </w:lvl>
   </w:abstractNum>
-  <w:abstractNum w:abstractNumId="11" w15:restartNumberingAfterBreak="0">
+  <w:abstractNum w:abstractNumId="12" w15:restartNumberingAfterBreak="0">
     <w:nsid w:val="2A511A11"/>
     <w:multiLevelType w:val="hybridMultilevel"/>
     <w:tmpl w:val="65D2BC5C"/>
@@ -16574,7 +16460,7 @@
       </w:rPr>
     </w:lvl>
   </w:abstractNum>
-  <w:abstractNum w:abstractNumId="12" w15:restartNumberingAfterBreak="0">
+  <w:abstractNum w:abstractNumId="13" w15:restartNumberingAfterBreak="0">
     <w:nsid w:val="2C7E1E1A"/>
     <w:multiLevelType w:val="hybridMultilevel"/>
     <w:tmpl w:val="0100DE42"/>
@@ -16687,7 +16573,7 @@
       </w:rPr>
     </w:lvl>
   </w:abstractNum>
-  <w:abstractNum w:abstractNumId="13" w15:restartNumberingAfterBreak="0">
+  <w:abstractNum w:abstractNumId="14" w15:restartNumberingAfterBreak="0">
     <w:nsid w:val="2F632802"/>
     <w:multiLevelType w:val="hybridMultilevel"/>
     <w:tmpl w:val="041263F8"/>
@@ -16800,7 +16686,7 @@
       </w:rPr>
     </w:lvl>
   </w:abstractNum>
-  <w:abstractNum w:abstractNumId="14" w15:restartNumberingAfterBreak="0">
+  <w:abstractNum w:abstractNumId="15" w15:restartNumberingAfterBreak="0">
     <w:nsid w:val="317E7884"/>
     <w:multiLevelType w:val="hybridMultilevel"/>
     <w:tmpl w:val="75C476E4"/>
@@ -16889,7 +16775,7 @@
       </w:pPr>
     </w:lvl>
   </w:abstractNum>
-  <w:abstractNum w:abstractNumId="15" w15:restartNumberingAfterBreak="0">
+  <w:abstractNum w:abstractNumId="16" w15:restartNumberingAfterBreak="0">
     <w:nsid w:val="36F81198"/>
     <w:multiLevelType w:val="hybridMultilevel"/>
     <w:tmpl w:val="3708A740"/>
@@ -17002,7 +16888,7 @@
       </w:rPr>
     </w:lvl>
   </w:abstractNum>
-  <w:abstractNum w:abstractNumId="16" w15:restartNumberingAfterBreak="0">
+  <w:abstractNum w:abstractNumId="17" w15:restartNumberingAfterBreak="0">
     <w:nsid w:val="38D20463"/>
     <w:multiLevelType w:val="hybridMultilevel"/>
     <w:tmpl w:val="FAE4AA5A"/>
@@ -17115,7 +17001,7 @@
       </w:rPr>
     </w:lvl>
   </w:abstractNum>
-  <w:abstractNum w:abstractNumId="17" w15:restartNumberingAfterBreak="0">
+  <w:abstractNum w:abstractNumId="18" w15:restartNumberingAfterBreak="0">
     <w:nsid w:val="392B59C7"/>
     <w:multiLevelType w:val="hybridMultilevel"/>
     <w:tmpl w:val="03D6693C"/>
@@ -17228,7 +17114,7 @@
       </w:rPr>
     </w:lvl>
   </w:abstractNum>
-  <w:abstractNum w:abstractNumId="18" w15:restartNumberingAfterBreak="0">
+  <w:abstractNum w:abstractNumId="19" w15:restartNumberingAfterBreak="0">
     <w:nsid w:val="3A7138C9"/>
     <w:multiLevelType w:val="hybridMultilevel"/>
     <w:tmpl w:val="3E2A27F4"/>
@@ -17341,7 +17227,7 @@
       </w:rPr>
     </w:lvl>
   </w:abstractNum>
-  <w:abstractNum w:abstractNumId="19" w15:restartNumberingAfterBreak="0">
+  <w:abstractNum w:abstractNumId="20" w15:restartNumberingAfterBreak="0">
     <w:nsid w:val="3C391731"/>
     <w:multiLevelType w:val="hybridMultilevel"/>
     <w:tmpl w:val="5E149B14"/>
@@ -17454,7 +17340,7 @@
       </w:rPr>
     </w:lvl>
   </w:abstractNum>
-  <w:abstractNum w:abstractNumId="20" w15:restartNumberingAfterBreak="0">
+  <w:abstractNum w:abstractNumId="21" w15:restartNumberingAfterBreak="0">
     <w:nsid w:val="3DC97A83"/>
     <w:multiLevelType w:val="hybridMultilevel"/>
     <w:tmpl w:val="1428B8F8"/>
@@ -17543,7 +17429,7 @@
       </w:pPr>
     </w:lvl>
   </w:abstractNum>
-  <w:abstractNum w:abstractNumId="21" w15:restartNumberingAfterBreak="0">
+  <w:abstractNum w:abstractNumId="22" w15:restartNumberingAfterBreak="0">
     <w:nsid w:val="41621EAB"/>
     <w:multiLevelType w:val="hybridMultilevel"/>
     <w:tmpl w:val="4B544456"/>
@@ -17656,7 +17542,7 @@
       </w:rPr>
     </w:lvl>
   </w:abstractNum>
-  <w:abstractNum w:abstractNumId="22" w15:restartNumberingAfterBreak="0">
+  <w:abstractNum w:abstractNumId="23" w15:restartNumberingAfterBreak="0">
     <w:nsid w:val="45633A73"/>
     <w:multiLevelType w:val="hybridMultilevel"/>
     <w:tmpl w:val="BCE4EDB2"/>
@@ -17769,7 +17655,7 @@
       </w:rPr>
     </w:lvl>
   </w:abstractNum>
-  <w:abstractNum w:abstractNumId="23" w15:restartNumberingAfterBreak="0">
+  <w:abstractNum w:abstractNumId="24" w15:restartNumberingAfterBreak="0">
     <w:nsid w:val="462E1195"/>
     <w:multiLevelType w:val="multilevel"/>
     <w:tmpl w:val="EFFC3B96"/>
@@ -17887,7 +17773,7 @@
       </w:rPr>
     </w:lvl>
   </w:abstractNum>
-  <w:abstractNum w:abstractNumId="24" w15:restartNumberingAfterBreak="0">
+  <w:abstractNum w:abstractNumId="25" w15:restartNumberingAfterBreak="0">
     <w:nsid w:val="46821ECF"/>
     <w:multiLevelType w:val="hybridMultilevel"/>
     <w:tmpl w:val="853CC222"/>
@@ -18000,7 +17886,7 @@
       </w:rPr>
     </w:lvl>
   </w:abstractNum>
-  <w:abstractNum w:abstractNumId="25" w15:restartNumberingAfterBreak="0">
+  <w:abstractNum w:abstractNumId="26" w15:restartNumberingAfterBreak="0">
     <w:nsid w:val="46CF27C0"/>
     <w:multiLevelType w:val="hybridMultilevel"/>
     <w:tmpl w:val="0F0C8674"/>
@@ -18112,7 +17998,7 @@
       </w:rPr>
     </w:lvl>
   </w:abstractNum>
-  <w:abstractNum w:abstractNumId="26" w15:restartNumberingAfterBreak="0">
+  <w:abstractNum w:abstractNumId="27" w15:restartNumberingAfterBreak="0">
     <w:nsid w:val="472A6756"/>
     <w:multiLevelType w:val="hybridMultilevel"/>
     <w:tmpl w:val="5AB07832"/>
@@ -18225,7 +18111,7 @@
       </w:rPr>
     </w:lvl>
   </w:abstractNum>
-  <w:abstractNum w:abstractNumId="27" w15:restartNumberingAfterBreak="0">
+  <w:abstractNum w:abstractNumId="28" w15:restartNumberingAfterBreak="0">
     <w:nsid w:val="474C7385"/>
     <w:multiLevelType w:val="hybridMultilevel"/>
     <w:tmpl w:val="644AE342"/>
@@ -18338,7 +18224,7 @@
       </w:rPr>
     </w:lvl>
   </w:abstractNum>
-  <w:abstractNum w:abstractNumId="28" w15:restartNumberingAfterBreak="0">
+  <w:abstractNum w:abstractNumId="29" w15:restartNumberingAfterBreak="0">
     <w:nsid w:val="49766EFB"/>
     <w:multiLevelType w:val="hybridMultilevel"/>
     <w:tmpl w:val="E19E185C"/>
@@ -18427,7 +18313,7 @@
       </w:pPr>
     </w:lvl>
   </w:abstractNum>
-  <w:abstractNum w:abstractNumId="29" w15:restartNumberingAfterBreak="0">
+  <w:abstractNum w:abstractNumId="30" w15:restartNumberingAfterBreak="0">
     <w:nsid w:val="5A025AED"/>
     <w:multiLevelType w:val="hybridMultilevel"/>
     <w:tmpl w:val="74CE8BA4"/>
@@ -18540,7 +18426,7 @@
       </w:rPr>
     </w:lvl>
   </w:abstractNum>
-  <w:abstractNum w:abstractNumId="30" w15:restartNumberingAfterBreak="0">
+  <w:abstractNum w:abstractNumId="31" w15:restartNumberingAfterBreak="0">
     <w:nsid w:val="5F1F7E70"/>
     <w:multiLevelType w:val="hybridMultilevel"/>
     <w:tmpl w:val="9B50EF66"/>
@@ -18653,7 +18539,7 @@
       </w:rPr>
     </w:lvl>
   </w:abstractNum>
-  <w:abstractNum w:abstractNumId="31" w15:restartNumberingAfterBreak="0">
+  <w:abstractNum w:abstractNumId="32" w15:restartNumberingAfterBreak="0">
     <w:nsid w:val="60072613"/>
     <w:multiLevelType w:val="hybridMultilevel"/>
     <w:tmpl w:val="7FFC82D2"/>
@@ -18766,7 +18652,7 @@
       </w:rPr>
     </w:lvl>
   </w:abstractNum>
-  <w:abstractNum w:abstractNumId="32" w15:restartNumberingAfterBreak="0">
+  <w:abstractNum w:abstractNumId="33" w15:restartNumberingAfterBreak="0">
     <w:nsid w:val="63E93895"/>
     <w:multiLevelType w:val="hybridMultilevel"/>
     <w:tmpl w:val="978A36CA"/>
@@ -18879,7 +18765,7 @@
       </w:rPr>
     </w:lvl>
   </w:abstractNum>
-  <w:abstractNum w:abstractNumId="33" w15:restartNumberingAfterBreak="0">
+  <w:abstractNum w:abstractNumId="34" w15:restartNumberingAfterBreak="0">
     <w:nsid w:val="6538675C"/>
     <w:multiLevelType w:val="hybridMultilevel"/>
     <w:tmpl w:val="87DEBB58"/>
@@ -18992,7 +18878,7 @@
       </w:rPr>
     </w:lvl>
   </w:abstractNum>
-  <w:abstractNum w:abstractNumId="34" w15:restartNumberingAfterBreak="0">
+  <w:abstractNum w:abstractNumId="35" w15:restartNumberingAfterBreak="0">
     <w:nsid w:val="683741D2"/>
     <w:multiLevelType w:val="hybridMultilevel"/>
     <w:tmpl w:val="613A4824"/>
@@ -19105,7 +18991,7 @@
       </w:rPr>
     </w:lvl>
   </w:abstractNum>
-  <w:abstractNum w:abstractNumId="35" w15:restartNumberingAfterBreak="0">
+  <w:abstractNum w:abstractNumId="36" w15:restartNumberingAfterBreak="0">
     <w:nsid w:val="6AD07D18"/>
     <w:multiLevelType w:val="hybridMultilevel"/>
     <w:tmpl w:val="910617CA"/>
@@ -19218,7 +19104,7 @@
       </w:rPr>
     </w:lvl>
   </w:abstractNum>
-  <w:abstractNum w:abstractNumId="36" w15:restartNumberingAfterBreak="0">
+  <w:abstractNum w:abstractNumId="37" w15:restartNumberingAfterBreak="0">
     <w:nsid w:val="6C9011EC"/>
     <w:multiLevelType w:val="hybridMultilevel"/>
     <w:tmpl w:val="0BA06C96"/>
@@ -19331,7 +19217,7 @@
       </w:rPr>
     </w:lvl>
   </w:abstractNum>
-  <w:abstractNum w:abstractNumId="37" w15:restartNumberingAfterBreak="0">
+  <w:abstractNum w:abstractNumId="38" w15:restartNumberingAfterBreak="0">
     <w:nsid w:val="722C4E9C"/>
     <w:multiLevelType w:val="hybridMultilevel"/>
     <w:tmpl w:val="0DCA5AD8"/>
@@ -19444,7 +19330,7 @@
       </w:rPr>
     </w:lvl>
   </w:abstractNum>
-  <w:abstractNum w:abstractNumId="38" w15:restartNumberingAfterBreak="0">
+  <w:abstractNum w:abstractNumId="39" w15:restartNumberingAfterBreak="0">
     <w:nsid w:val="739275A2"/>
     <w:multiLevelType w:val="hybridMultilevel"/>
     <w:tmpl w:val="93804136"/>
@@ -19557,7 +19443,7 @@
       </w:rPr>
     </w:lvl>
   </w:abstractNum>
-  <w:abstractNum w:abstractNumId="39" w15:restartNumberingAfterBreak="0">
+  <w:abstractNum w:abstractNumId="40" w15:restartNumberingAfterBreak="0">
     <w:nsid w:val="7A2C2BB9"/>
     <w:multiLevelType w:val="hybridMultilevel"/>
     <w:tmpl w:val="ABEE6E94"/>
@@ -19646,7 +19532,7 @@
       </w:pPr>
     </w:lvl>
   </w:abstractNum>
-  <w:abstractNum w:abstractNumId="40" w15:restartNumberingAfterBreak="0">
+  <w:abstractNum w:abstractNumId="41" w15:restartNumberingAfterBreak="0">
     <w:nsid w:val="7A501B11"/>
     <w:multiLevelType w:val="hybridMultilevel"/>
     <w:tmpl w:val="581EE632"/>
@@ -19759,7 +19645,7 @@
       </w:rPr>
     </w:lvl>
   </w:abstractNum>
-  <w:abstractNum w:abstractNumId="41" w15:restartNumberingAfterBreak="0">
+  <w:abstractNum w:abstractNumId="42" w15:restartNumberingAfterBreak="0">
     <w:nsid w:val="7E194901"/>
     <w:multiLevelType w:val="hybridMultilevel"/>
     <w:tmpl w:val="9DEE24DA"/>
@@ -19873,25 +19759,25 @@
     </w:lvl>
   </w:abstractNum>
   <w:num w:numId="1" w16cid:durableId="327830793">
-    <w:abstractNumId w:val="11"/>
+    <w:abstractNumId w:val="12"/>
   </w:num>
   <w:num w:numId="2" w16cid:durableId="1517231647">
-    <w:abstractNumId w:val="25"/>
+    <w:abstractNumId w:val="26"/>
   </w:num>
   <w:num w:numId="3" w16cid:durableId="1519393575">
+    <w:abstractNumId w:val="33"/>
+  </w:num>
+  <w:num w:numId="4" w16cid:durableId="959339942">
+    <w:abstractNumId w:val="37"/>
+  </w:num>
+  <w:num w:numId="5" w16cid:durableId="258374368">
+    <w:abstractNumId w:val="41"/>
+  </w:num>
+  <w:num w:numId="6" w16cid:durableId="1484003343">
     <w:abstractNumId w:val="32"/>
   </w:num>
-  <w:num w:numId="4" w16cid:durableId="959339942">
-    <w:abstractNumId w:val="36"/>
-  </w:num>
-  <w:num w:numId="5" w16cid:durableId="258374368">
-    <w:abstractNumId w:val="40"/>
-  </w:num>
-  <w:num w:numId="6" w16cid:durableId="1484003343">
-    <w:abstractNumId w:val="31"/>
-  </w:num>
   <w:num w:numId="7" w16cid:durableId="2049136046">
-    <w:abstractNumId w:val="27"/>
+    <w:abstractNumId w:val="28"/>
   </w:num>
   <w:num w:numId="8" w16cid:durableId="113594816">
     <w:abstractNumId w:val="3"/>
@@ -19900,103 +19786,106 @@
     <w:abstractNumId w:val="5"/>
   </w:num>
   <w:num w:numId="10" w16cid:durableId="121000152">
-    <w:abstractNumId w:val="33"/>
+    <w:abstractNumId w:val="34"/>
   </w:num>
   <w:num w:numId="11" w16cid:durableId="616453306">
-    <w:abstractNumId w:val="18"/>
+    <w:abstractNumId w:val="19"/>
   </w:num>
   <w:num w:numId="12" w16cid:durableId="22681142">
-    <w:abstractNumId w:val="41"/>
+    <w:abstractNumId w:val="42"/>
   </w:num>
   <w:num w:numId="13" w16cid:durableId="1792699553">
     <w:abstractNumId w:val="2"/>
   </w:num>
   <w:num w:numId="14" w16cid:durableId="2014644966">
-    <w:abstractNumId w:val="16"/>
+    <w:abstractNumId w:val="17"/>
   </w:num>
   <w:num w:numId="15" w16cid:durableId="2047752707">
-    <w:abstractNumId w:val="23"/>
+    <w:abstractNumId w:val="24"/>
   </w:num>
   <w:num w:numId="16" w16cid:durableId="2017808260">
-    <w:abstractNumId w:val="13"/>
+    <w:abstractNumId w:val="14"/>
   </w:num>
   <w:num w:numId="17" w16cid:durableId="919945909">
-    <w:abstractNumId w:val="35"/>
+    <w:abstractNumId w:val="36"/>
   </w:num>
   <w:num w:numId="18" w16cid:durableId="1310011085">
     <w:abstractNumId w:val="6"/>
   </w:num>
   <w:num w:numId="19" w16cid:durableId="238757593">
-    <w:abstractNumId w:val="7"/>
+    <w:abstractNumId w:val="8"/>
   </w:num>
   <w:num w:numId="20" w16cid:durableId="749693556">
-    <w:abstractNumId w:val="24"/>
+    <w:abstractNumId w:val="25"/>
   </w:num>
   <w:num w:numId="21" w16cid:durableId="1029797103">
-    <w:abstractNumId w:val="17"/>
+    <w:abstractNumId w:val="18"/>
   </w:num>
   <w:num w:numId="22" w16cid:durableId="1291590151">
-    <w:abstractNumId w:val="34"/>
+    <w:abstractNumId w:val="35"/>
   </w:num>
   <w:num w:numId="23" w16cid:durableId="993949867">
     <w:abstractNumId w:val="4"/>
   </w:num>
   <w:num w:numId="24" w16cid:durableId="1740050857">
-    <w:abstractNumId w:val="20"/>
+    <w:abstractNumId w:val="21"/>
   </w:num>
   <w:num w:numId="25" w16cid:durableId="524634176">
     <w:abstractNumId w:val="0"/>
   </w:num>
   <w:num w:numId="26" w16cid:durableId="712193739">
-    <w:abstractNumId w:val="14"/>
+    <w:abstractNumId w:val="15"/>
   </w:num>
   <w:num w:numId="27" w16cid:durableId="426469020">
-    <w:abstractNumId w:val="15"/>
+    <w:abstractNumId w:val="16"/>
   </w:num>
   <w:num w:numId="28" w16cid:durableId="1119103350">
     <w:abstractNumId w:val="1"/>
   </w:num>
   <w:num w:numId="29" w16cid:durableId="1835611462">
-    <w:abstractNumId w:val="28"/>
+    <w:abstractNumId w:val="29"/>
   </w:num>
   <w:num w:numId="30" w16cid:durableId="542644157">
+    <w:abstractNumId w:val="40"/>
+  </w:num>
+  <w:num w:numId="31" w16cid:durableId="81030961">
+    <w:abstractNumId w:val="38"/>
+  </w:num>
+  <w:num w:numId="32" w16cid:durableId="1426923183">
+    <w:abstractNumId w:val="31"/>
+  </w:num>
+  <w:num w:numId="33" w16cid:durableId="819348164">
+    <w:abstractNumId w:val="22"/>
+  </w:num>
+  <w:num w:numId="34" w16cid:durableId="1999379367">
+    <w:abstractNumId w:val="13"/>
+  </w:num>
+  <w:num w:numId="35" w16cid:durableId="694506038">
+    <w:abstractNumId w:val="27"/>
+  </w:num>
+  <w:num w:numId="36" w16cid:durableId="1977759231">
+    <w:abstractNumId w:val="30"/>
+  </w:num>
+  <w:num w:numId="37" w16cid:durableId="2040474236">
+    <w:abstractNumId w:val="11"/>
+  </w:num>
+  <w:num w:numId="38" w16cid:durableId="520708767">
     <w:abstractNumId w:val="39"/>
   </w:num>
-  <w:num w:numId="31" w16cid:durableId="81030961">
-    <w:abstractNumId w:val="37"/>
-  </w:num>
-  <w:num w:numId="32" w16cid:durableId="1426923183">
-    <w:abstractNumId w:val="30"/>
-  </w:num>
-  <w:num w:numId="33" w16cid:durableId="819348164">
-    <w:abstractNumId w:val="21"/>
-  </w:num>
-  <w:num w:numId="34" w16cid:durableId="1999379367">
-    <w:abstractNumId w:val="12"/>
-  </w:num>
-  <w:num w:numId="35" w16cid:durableId="694506038">
-    <w:abstractNumId w:val="26"/>
-  </w:num>
-  <w:num w:numId="36" w16cid:durableId="1977759231">
-    <w:abstractNumId w:val="29"/>
-  </w:num>
-  <w:num w:numId="37" w16cid:durableId="2040474236">
+  <w:num w:numId="39" w16cid:durableId="1052726144">
     <w:abstractNumId w:val="10"/>
   </w:num>
-  <w:num w:numId="38" w16cid:durableId="520708767">
-    <w:abstractNumId w:val="38"/>
+  <w:num w:numId="40" w16cid:durableId="370880080">
+    <w:abstractNumId w:val="23"/>
   </w:num>
-  <w:num w:numId="39" w16cid:durableId="1052726144">
+  <w:num w:numId="41" w16cid:durableId="1804232952">
+    <w:abstractNumId w:val="20"/>
+  </w:num>
+  <w:num w:numId="42" w16cid:durableId="232859322">
     <w:abstractNumId w:val="9"/>
   </w:num>
-  <w:num w:numId="40" w16cid:durableId="370880080">
-    <w:abstractNumId w:val="22"/>
-  </w:num>
-  <w:num w:numId="41" w16cid:durableId="1804232952">
-    <w:abstractNumId w:val="19"/>
-  </w:num>
-  <w:num w:numId="42" w16cid:durableId="232859322">
-    <w:abstractNumId w:val="8"/>
+  <w:num w:numId="43" w16cid:durableId="2130122149">
+    <w:abstractNumId w:val="7"/>
   </w:num>
   <w:numIdMacAtCleanup w:val="42"/>
 </w:numbering>

</xml_diff>